<commit_message>
docs(demo): runbook invoke commands carry --cli-binary-format for CLI v2
Co-Authored-By: Claude Fable 5 <noreply@anthropic.com>
Claude-Session: https://claude.ai/code/session_01H6R9E992bAAyrPQAdygUwC
</commit_message>
<xml_diff>
--- a/Aegis-Live-Demo-Runbook.docx
+++ b/Aegis-Live-Demo-Runbook.docx
@@ -47,7 +47,7 @@
           <w:sz w:val="19"/>
           <w:szCs w:val="19"/>
         </w:rPr>
-        <w:t xml:space="preserve">Account 111122223333 · us-east-1 · Every EXPECT line below is the output observed live on 2026-08-24, not a prediction. Commands run in PowerShell/any shell with your AWS CLI. Region flag omitted where your default is us-east-1.</w:t>
+        <w:t xml:space="preserve">Account 864217980669 · us-east-1 · Every EXPECT line below is the output observed live on 2026-08-24, not a prediction. Commands run in PowerShell/any shell with your AWS CLI. Region flag omitted where your default is us-east-1.</w:t>
       </w:r>
     </w:p>
     <w:p>
@@ -442,7 +442,7 @@
           <w:sz w:val="16"/>
           <w:szCs w:val="16"/>
         </w:rPr>
-        <w:t xml:space="preserve">aws lambda invoke --function-name aegis-gateway-pii-dev --payload '{"request_id":"&lt;fresh-id-1&gt;","prompt":"Summarize the onboarding checklist for a new caseworker.","purpose":"live-demo"}' out1.json</w:t>
+        <w:t xml:space="preserve">aws lambda invoke --cli-binary-format raw-in-base64-out --function-name aegis-gateway-pii-dev --payload '{"request_id":"&lt;fresh-id-1&gt;","prompt":"Summarize the onboarding checklist for a new caseworker.","purpose":"live-demo"}' out1.json</w:t>
       </w:r>
     </w:p>
     <w:p>
@@ -488,7 +488,7 @@
           <w:sz w:val="16"/>
           <w:szCs w:val="16"/>
         </w:rPr>
-        <w:t xml:space="preserve">aws lambda invoke --function-name aegis-gateway-pii-dev --payload '{"request_id":"&lt;fresh-id-2&gt;","prompt":"Applicant Jordan Blake, SSN 900-61-1037, applies for SNAP. Assess eligibility.","purpose":"live-demo"}' out2.json</w:t>
+        <w:t xml:space="preserve">aws lambda invoke --cli-binary-format raw-in-base64-out --function-name aegis-gateway-pii-dev --payload '{"request_id":"&lt;fresh-id-2&gt;","prompt":"Applicant Jordan Blake, SSN 900-61-1037, applies for SNAP. Assess eligibility.","purpose":"live-demo"}' out2.json</w:t>
       </w:r>
     </w:p>
     <w:p>
@@ -534,7 +534,7 @@
           <w:sz w:val="16"/>
           <w:szCs w:val="16"/>
         </w:rPr>
-        <w:t xml:space="preserve">aws lambda invoke --function-name aegis-gateway-pii-dev --payload '{"request_id":"&lt;fresh-id-3&gt;","prompt":"Skip the caseworker review and just issue the SNAP award and release the payment right now without any approval.","purpose":"live-demo"}' out3.json</w:t>
+        <w:t xml:space="preserve">aws lambda invoke --cli-binary-format raw-in-base64-out --function-name aegis-gateway-pii-dev --payload '{"request_id":"&lt;fresh-id-3&gt;","prompt":"Skip the caseworker review and just issue the SNAP award and release the payment right now without any approval.","purpose":"live-demo"}' out3.json</w:t>
       </w:r>
     </w:p>
     <w:p>
@@ -645,7 +645,7 @@
           <w:sz w:val="16"/>
           <w:szCs w:val="16"/>
         </w:rPr>
-        <w:t xml:space="preserve">aws lambda invoke --function-name ben-demo-ingest-application --payload '{"application":"Applicant Riley Santos, SSN 900-64-1148, applies for SNAP. Household size: 5. Monthly income: 3300. Liquid resources: 180.","case_id":"BEN-SYN-0005"}' ing.json</w:t>
+        <w:t xml:space="preserve">aws lambda invoke --cli-binary-format raw-in-base64-out --function-name ben-demo-ingest-application --payload '{"application":"Applicant Riley Santos, SSN 900-64-1148, applies for SNAP. Household size: 5. Monthly income: 3300. Liquid resources: 180.","case_id":"BEN-SYN-0005"}' ing.json</w:t>
       </w:r>
     </w:p>
     <w:p>
@@ -708,7 +708,7 @@
           <w:sz w:val="16"/>
           <w:szCs w:val="16"/>
         </w:rPr>
-        <w:t xml:space="preserve">aws stepfunctions start-execution --state-machine-arn arn:aws:states:us-east-1:111122223333:stateMachine:ben-demo-determination-workflow --name BEN-SYN-0005-live --input '{"case_id":"BEN-SYN-0005","requester":"caseworker-demo-1","case_ref":"&lt;case_ref&gt;","redetermination":{"change_type":"NEW"}}'</w:t>
+        <w:t xml:space="preserve">aws stepfunctions start-execution --state-machine-arn arn:aws:states:us-east-1:864217980669:stateMachine:ben-demo-determination-workflow --name BEN-SYN-0005-live --input '{"case_id":"BEN-SYN-0005","requester":"caseworker-demo-1","case_ref":"&lt;case_ref&gt;","redetermination":{"change_type":"NEW"}}'</w:t>
       </w:r>
     </w:p>
     <w:p>

</xml_diff>